<commit_message>
docs: refresh submission artifacts
</commit_message>
<xml_diff>
--- a/docs/Meeting_Notes_Distiller_SRS.docx
+++ b/docs/Meeting_Notes_Distiller_SRS.docx
@@ -285,7 +285,7 @@
         <w:pStyle w:val="ListBullet"/>
       </w:pPr>
       <w:r>
-        <w:t>Normalize speaker-colon, timestamp-dash, timestamp-block, and unstructured text.</w:t>
+        <w:t>Normalize speaker-colon, timestamp-dash, timestamp-block, unstructured prose, and mixed Markdown/metadata notes.</w:t>
       </w:r>
     </w:p>
     <w:p>
@@ -1075,7 +1075,7 @@
           </w:tcPr>
           <w:p>
             <w:r>
-              <w:t>Support at least three transcript layouts.</w:t>
+              <w:t>Support at least three transcript layouts and mixed notes.</w:t>
             </w:r>
           </w:p>
         </w:tc>
@@ -1092,7 +1092,7 @@
           </w:tcPr>
           <w:p>
             <w:r>
-              <w:t>Speaker-colon, timestamp-dash, and timestamp-block normalization plus unstructured fallback.</w:t>
+              <w:t>Speaker-colon, timestamp-dash, timestamp-block, and unstructured normalization retain typed speech, note, heading, and metadata entries.</w:t>
             </w:r>
           </w:p>
         </w:tc>
@@ -1128,7 +1128,7 @@
           </w:tcPr>
           <w:p>
             <w:r>
-              <w:t>Extract unique participants from speaker information only.</w:t>
+              <w:t>Extract unique participants without treating labels as people.</w:t>
             </w:r>
           </w:p>
         </w:tc>
@@ -1145,7 +1145,7 @@
           </w:tcPr>
           <w:p>
             <w:r>
-              <w:t>Participant module deduplicates normalized non-null speakers.</w:t>
+              <w:t>Participant module deduplicates actual speakers, named attendee/facilitator metadata, and narrowly tested narrative-name evidence.</w:t>
             </w:r>
           </w:p>
         </w:tc>
@@ -1198,7 +1198,7 @@
           </w:tcPr>
           <w:p>
             <w:r>
-              <w:t>Fixed evidence-bound subject categories group matching utterances; unmatched text is General discussion.</w:t>
+              <w:t>Explicit Markdown topic headings define sections; otherwise fixed evidence-bound subject categories group matching utterances.</w:t>
             </w:r>
           </w:p>
         </w:tc>
@@ -1340,7 +1340,7 @@
           </w:tcPr>
           <w:p>
             <w:r>
-              <w:t>Flag meetings with unresolved options or conflicting dates.</w:t>
+              <w:t>Flag meetings with unresolved options or conflicting information.</w:t>
             </w:r>
           </w:p>
         </w:tc>
@@ -1357,7 +1357,7 @@
           </w:tcPr>
           <w:p>
             <w:r>
-              <w:t>No-decision and date-conflict flags require multiple alternatives and no explicit decision.</w:t>
+              <w:t>No-decision and date-conflict rules retain explicit unresolved evidence; tested Thai rules detect inconsistent launch and feature-freeze/dashboard timing.</w:t>
             </w:r>
           </w:p>
         </w:tc>
@@ -2338,7 +2338,7 @@
     </w:p>
     <w:p>
       <w:r>
-        <w:t>Normalization retains line numbers, timestamps, nullable speakers, and utterance text. Semantic modules consume only the normalized representation. Deterministic meeting IDs hash the filename and normalized content. The batch response includes successful meetings, named failures, grouped actions, and an ISO processing timestamp.</w:t>
+        <w:t>Normalization retains line numbers, timestamps, nullable speakers, source text, and a speech/note/heading/metadata kind. Semantic modules consume only the normalized representation, preventing metadata labels and Markdown headings from becoming participants. Deterministic meeting IDs hash the filename and normalized content. The batch response includes successful meetings, named failures, grouped actions, and an ISO processing timestamp.</w:t>
       </w:r>
     </w:p>
     <w:p>
@@ -2713,7 +2713,7 @@
         <w:pStyle w:val="ListBullet"/>
       </w:pPr>
       <w:r>
-        <w:t>Unit tests cover all three required formats, unstructured and empty input, duplicate participants, explicit/non-decisions, multiple actions, missing owners, Thai patterns, and conflicts.</w:t>
+        <w:t>Unit tests cover all three required formats, mixed Markdown/metadata notes, unstructured and empty input, duplicate participants, explicit/non-decisions, multiple actions, missing owners, Thai patterns, and conflicts.</w:t>
       </w:r>
     </w:p>
     <w:p>
@@ -2745,7 +2745,7 @@
         <w:pStyle w:val="ListBullet"/>
       </w:pPr>
       <w:r>
-        <w:t>Playwright verifies successful analysis, multiple upload rounds, grouped ownership, no-decision warning, unsupported extension, and report download.</w:t>
+        <w:t>Playwright verifies successful analysis, multiple upload rounds, grouped ownership, no-decision warning, unsupported extension, report download, and navigation across all four supplied English/Thai instructor samples.</w:t>
       </w:r>
     </w:p>
     <w:p>
@@ -2777,7 +2777,7 @@
         <w:pStyle w:val="ListBullet"/>
       </w:pPr>
       <w:r>
-        <w:t>Speaker names appear in supported line headers when participant extraction is expected.</w:t>
+        <w:t>Participant names appear in supported speaker headers, named attendee/facilitator metadata, or a narrowly tested narrative-name phrase.</w:t>
       </w:r>
     </w:p>
     <w:p>
@@ -3368,6 +3368,59 @@
           </w:p>
         </w:tc>
       </w:tr>
+      <w:tr>
+        <w:tc>
+          <w:tcPr>
+            <w:tcW w:type="dxa" w:w="1080"/>
+            <w:vAlign w:val="top"/>
+            <w:tcMar>
+              <w:top w:w="80" w:type="dxa"/>
+              <w:start w:w="120" w:type="dxa"/>
+              <w:bottom w:w="80" w:type="dxa"/>
+              <w:end w:w="120" w:type="dxa"/>
+            </w:tcMar>
+          </w:tcPr>
+          <w:p>
+            <w:r>
+              <w:t>AC-09</w:t>
+            </w:r>
+          </w:p>
+        </w:tc>
+        <w:tc>
+          <w:tcPr>
+            <w:tcW w:type="dxa" w:w="3816"/>
+            <w:vAlign w:val="top"/>
+            <w:tcMar>
+              <w:top w:w="80" w:type="dxa"/>
+              <w:start w:w="120" w:type="dxa"/>
+              <w:bottom w:w="80" w:type="dxa"/>
+              <w:end w:w="120" w:type="dxa"/>
+            </w:tcMar>
+          </w:tcPr>
+          <w:p>
+            <w:r>
+              <w:t>The four supplied English/Thai note files produce evidence-bound browser results.</w:t>
+            </w:r>
+          </w:p>
+        </w:tc>
+        <w:tc>
+          <w:tcPr>
+            <w:tcW w:type="dxa" w:w="5184"/>
+            <w:vAlign w:val="top"/>
+            <w:tcMar>
+              <w:top w:w="80" w:type="dxa"/>
+              <w:start w:w="120" w:type="dxa"/>
+              <w:bottom w:w="80" w:type="dxa"/>
+              <w:end w:w="120" w:type="dxa"/>
+            </w:tcMar>
+          </w:tcPr>
+          <w:p>
+            <w:r>
+              <w:t>Covered by instructor fixture unit regressions and a four-file Playwright workflow.</w:t>
+            </w:r>
+          </w:p>
+        </w:tc>
+      </w:tr>
     </w:tbl>
     <w:p/>
     <w:p>
@@ -3391,7 +3444,7 @@
         <w:pStyle w:val="ListBullet"/>
       </w:pPr>
       <w:r>
-        <w:t>English has the broadest coverage; Thai support is limited to tested owner, weekday, and decision patterns.</w:t>
+        <w:t>English has the broadest coverage; Thai support is deterministic and limited to tested participant, owner, date, decision, action, and conflict phrases.</w:t>
       </w:r>
     </w:p>
     <w:p>
@@ -3399,7 +3452,7 @@
         <w:pStyle w:val="ListBullet"/>
       </w:pPr>
       <w:r>
-        <w:t>Conflict detection targets competing dates around shared release/launch concepts, not arbitrary contradictions.</w:t>
+        <w:t>Conflict detection covers competing release/launch dates and the tested freeze/dashboard contradiction, not arbitrary logical contradictions.</w:t>
       </w:r>
     </w:p>
     <w:p>

</xml_diff>